<commit_message>
ca8 opening, answering, reply briefs: docx/render.sh, pagemap.awk, footer.xml and build-reference.sh give way to fb render: docx/reference.xml (base="xengine" with the builder's arguments and its "CA ..." styles), ca8.lua writing its needles in document order (headings with the text after them, citations per top-level block), #section lines, its footers in $FORMBOOK_FOOTERS and the body's section in $FORMBOOK_FINAL; baseline entries removed. fb's needle lookup (docxpages.rs) gains the awk's page-end rule: a body needle whose halves a page end and its footnotes separate is found by its head on the page and its tail at the top of the next (tested); every docx.pdf of the 57 other needle-writing folders (68 renders) byte-identical before and after. ca8 .docx.pdf byte-identical to the render before the port; check.sh typst, latex and docx 0 failed, XENG-001..003 pass (reply docx XENG-003 reported, as before) (fb-595.68.2)
</commit_message>
<xml_diff>
--- a/courts/eighth-circuit/court-of-appeals/answering-brief/usage/OUTPUT-answering-brief.docx
+++ b/courts/eighth-circuit/court-of-appeals/answering-brief/usage/OUTPUT-answering-brief.docx
@@ -4949,60 +4949,6 @@
 <w:comments xmlns:w="http://schemas.openxmlformats.org/wordprocessingml/2006/main" xmlns:m="http://schemas.openxmlformats.org/officeDocument/2006/math" xmlns:r="http://schemas.openxmlformats.org/officeDocument/2006/relationships" xmlns:o="urn:schemas-microsoft-com:office:office" xmlns:v="urn:schemas-microsoft-com:vml" xmlns:w10="urn:schemas-microsoft-com:office:word" xmlns:a="http://schemas.openxmlformats.org/drawingml/2006/main" xmlns:pic="http://schemas.openxmlformats.org/drawingml/2006/picture" xmlns:wp="http://schemas.openxmlformats.org/drawingml/2006/wordprocessingDrawing"/>
 </file>
 
-<file path=word/footer-arabic.xml><?xml version="1.0" encoding="utf-8"?>
-<w:ftr xmlns:w="http://schemas.openxmlformats.org/wordprocessingml/2006/main" xmlns:r="http://schemas.openxmlformats.org/officeDocument/2006/relationships">
-  <w:p>
-    <w:pPr>
-      <w:spacing w:before="0" w:after="0" w:line="240" w:lineRule="auto"/>
-      <w:ind w:firstLine="0"/>
-      <w:jc w:val="center"/>
-    </w:pPr>
-    <w:r>
-      <w:fldChar w:fldCharType="begin"/>
-    </w:r>
-    <w:r>
-      <w:instrText xml:space="preserve"> PAGE </w:instrText>
-    </w:r>
-    <w:r>
-      <w:fldChar w:fldCharType="separate"/>
-    </w:r>
-    <w:r>
-      <w:t>1</w:t>
-    </w:r>
-    <w:r>
-      <w:fldChar w:fldCharType="end"/>
-    </w:r>
-  </w:p>
-</w:ftr>
-</file>
-
-<file path=word/footer-roman.xml><?xml version="1.0" encoding="utf-8"?>
-<w:ftr xmlns:w="http://schemas.openxmlformats.org/wordprocessingml/2006/main" xmlns:r="http://schemas.openxmlformats.org/officeDocument/2006/relationships">
-  <w:p>
-    <w:pPr>
-      <w:spacing w:before="0" w:after="0" w:line="240" w:lineRule="auto"/>
-      <w:ind w:firstLine="0"/>
-      <w:jc w:val="center"/>
-    </w:pPr>
-    <w:r>
-      <w:fldChar w:fldCharType="begin"/>
-    </w:r>
-    <w:r>
-      <w:instrText xml:space="preserve"> PAGE </w:instrText>
-    </w:r>
-    <w:r>
-      <w:fldChar w:fldCharType="separate"/>
-    </w:r>
-    <w:r>
-      <w:t>1</w:t>
-    </w:r>
-    <w:r>
-      <w:fldChar w:fldCharType="end"/>
-    </w:r>
-  </w:p>
-</w:ftr>
-</file>
-
 <file path=word/footer1.xml><?xml version="1.0" encoding="utf-8"?>
 <w:ftr xmlns:w="http://schemas.openxmlformats.org/wordprocessingml/2006/main" xmlns:r="http://schemas.openxmlformats.org/officeDocument/2006/relationships">
   <w:p>
@@ -5064,6 +5010,126 @@
     </w:p>
   </w:footnote>
 </w:footnotes>
+</file>
+
+<file path=word/ftr-add.xml><?xml version="1.0" encoding="utf-8"?>
+<w:ftr xmlns:w="http://schemas.openxmlformats.org/wordprocessingml/2006/main" xmlns:r="http://schemas.openxmlformats.org/officeDocument/2006/relationships">
+  <w:p>
+    <w:pPr>
+      <w:spacing w:before="0" w:after="0"/>
+      <w:jc w:val="center"/>
+    </w:pPr>
+    <w:r>
+      <w:t>Add-</w:t>
+    </w:r>
+    <w:r>
+      <w:fldChar w:fldCharType="begin"/>
+    </w:r>
+    <w:r>
+      <w:instrText xml:space="preserve"> PAGE </w:instrText>
+    </w:r>
+    <w:r>
+      <w:fldChar w:fldCharType="separate"/>
+    </w:r>
+    <w:r>
+      <w:t>1</w:t>
+    </w:r>
+    <w:r>
+      <w:fldChar w:fldCharType="end"/>
+    </w:r>
+  </w:p>
+</w:ftr>
+</file>
+
+<file path=word/ftr-none.xml><?xml version="1.0" encoding="utf-8"?>
+<w:ftr xmlns:w="http://schemas.openxmlformats.org/wordprocessingml/2006/main" xmlns:r="http://schemas.openxmlformats.org/officeDocument/2006/relationships">
+  <w:p>
+    <w:pPr>
+      <w:spacing w:before="0" w:after="0"/>
+      <w:jc w:val="center"/>
+    </w:pPr>
+  </w:p>
+</w:ftr>
+</file>
+
+<file path=word/ftr-own1.xml><?xml version="1.0" encoding="utf-8"?>
+<w:ftr xmlns:w="http://schemas.openxmlformats.org/wordprocessingml/2006/main" xmlns:r="http://schemas.openxmlformats.org/officeDocument/2006/relationships">
+  <w:p>
+    <w:pPr>
+      <w:spacing w:before="0" w:after="0" w:line="240" w:lineRule="auto"/>
+      <w:ind w:firstLine="0"/>
+      <w:jc w:val="center"/>
+    </w:pPr>
+    <w:r>
+      <w:fldChar w:fldCharType="begin"/>
+    </w:r>
+    <w:r>
+      <w:instrText xml:space="preserve"> PAGE </w:instrText>
+    </w:r>
+    <w:r>
+      <w:fldChar w:fldCharType="separate"/>
+    </w:r>
+    <w:r>
+      <w:t>1</w:t>
+    </w:r>
+    <w:r>
+      <w:fldChar w:fldCharType="end"/>
+    </w:r>
+  </w:p>
+</w:ftr>
+</file>
+
+<file path=word/ftr-own2.xml><?xml version="1.0" encoding="utf-8"?>
+<w:ftr xmlns:w="http://schemas.openxmlformats.org/wordprocessingml/2006/main" xmlns:r="http://schemas.openxmlformats.org/officeDocument/2006/relationships">
+  <w:p>
+    <w:pPr>
+      <w:spacing w:before="0" w:after="0" w:line="240" w:lineRule="auto"/>
+      <w:ind w:firstLine="0"/>
+      <w:jc w:val="center"/>
+    </w:pPr>
+    <w:r>
+      <w:fldChar w:fldCharType="begin"/>
+    </w:r>
+    <w:r>
+      <w:instrText xml:space="preserve"> PAGE </w:instrText>
+    </w:r>
+    <w:r>
+      <w:fldChar w:fldCharType="separate"/>
+    </w:r>
+    <w:r>
+      <w:t>1</w:t>
+    </w:r>
+    <w:r>
+      <w:fldChar w:fldCharType="end"/>
+    </w:r>
+  </w:p>
+</w:ftr>
+</file>
+
+<file path=word/ftr-page.xml><?xml version="1.0" encoding="utf-8"?>
+<w:ftr xmlns:w="http://schemas.openxmlformats.org/wordprocessingml/2006/main" xmlns:r="http://schemas.openxmlformats.org/officeDocument/2006/relationships">
+  <w:p>
+    <w:pPr>
+      <w:spacing w:before="0" w:after="0"/>
+      <w:jc w:val="center"/>
+    </w:pPr>
+    <w:r>
+      <w:fldChar w:fldCharType="begin"/>
+    </w:r>
+    <w:r>
+      <w:instrText xml:space="preserve"> PAGE </w:instrText>
+    </w:r>
+    <w:r>
+      <w:fldChar w:fldCharType="separate"/>
+    </w:r>
+    <w:r>
+      <w:t>1</w:t>
+    </w:r>
+    <w:r>
+      <w:fldChar w:fldCharType="end"/>
+    </w:r>
+  </w:p>
+</w:ftr>
 </file>
 
 <file path=word/numbering.xml><?xml version="1.0" encoding="utf-8"?>

</xml_diff>